<commit_message>
Document local Jenkins service setup
</commit_message>
<xml_diff>
--- a/2311554901_NguyenTanThuan.docx
+++ b/2311554901_NguyenTanThuan.docx
@@ -170,7 +170,7 @@
         <w:tc>
           <w:p>
             <w:r>
-              <w:t>Chạy local tại http://localhost:8080; không sử dụng tài khoản Jenkins riêng</w:t>
+              <w:t>Chạy local tại http://localhost:8080 bằng Windows LocalSystem; không dùng tài khoản dịch vụ riêng</w:t>
             </w:r>
           </w:p>
         </w:tc>
@@ -267,7 +267,7 @@
           <w:color w:val="4B5563"/>
           <w:sz w:val="22"/>
         </w:rPr>
-        <w:t>Ghi chú: Jenkins được chạy trên máy cá nhân. Tài khoản trực tuyến sử dụng cho bài thực hành là tài khoản GitHub nêu trên.</w:t>
+        <w:t>Ghi chú: Dịch vụ Jenkins chạy local bằng Windows LocalSystem. Tài khoản trực tuyến sử dụng cho bài thực hành là tài khoản GitHub nêu trên.</w:t>
       </w:r>
     </w:p>
     <w:sectPr>

</xml_diff>